<commit_message>
customizer usage, some part of caching internals.
</commit_message>
<xml_diff>
--- a/docs (springboot)/module10_AOP.docx
+++ b/docs (springboot)/module10_AOP.docx
@@ -21,8 +21,6 @@
           <w:szCs w:val="22"/>
         </w:rPr>
       </w:pPr>
-      <w:bookmarkStart w:id="0" w:name="_GoBack"/>
-      <w:bookmarkEnd w:id="0"/>
       <w:r>
         <w:rPr>
           <w:rFonts w:hint="default" w:ascii="Bodoni MT" w:hAnsi="Bodoni MT" w:eastAsia="等线" w:cs="Bodoni MT"/>
@@ -2766,16 +2764,7 @@
           <w:szCs w:val="22"/>
           <w:lang w:val="en-US"/>
         </w:rPr>
-        <w:t xml:space="preserve"> </w:t>
-      </w:r>
-      <w:r>
-        <w:rPr>
-          <w:rFonts w:hint="default" w:ascii="Bodoni MT" w:hAnsi="Bodoni MT" w:eastAsia="等线" w:cs="Bodoni MT"/>
-          <w:sz w:val="22"/>
-          <w:szCs w:val="22"/>
-          <w:lang w:val="en-US"/>
-        </w:rPr>
-        <w:t>→</w:t>
+        <w:t xml:space="preserve"> →</w:t>
       </w:r>
       <w:r>
         <w:rPr>
@@ -2876,20 +2865,7 @@
           <w:szCs w:val="22"/>
           <w:lang w:val="en-US"/>
         </w:rPr>
-        <w:t xml:space="preserve"> </w:t>
-      </w:r>
-      <w:r>
-        <w:rPr>
-          <w:rFonts w:hint="default" w:ascii="Bodoni MT" w:hAnsi="Bodoni MT" w:eastAsia="等线" w:cs="Bodoni MT"/>
-          <w:b w:val="0"/>
-          <w:bCs w:val="0"/>
-          <w:i w:val="0"/>
-          <w:iCs w:val="0"/>
-          <w:sz w:val="22"/>
-          <w:szCs w:val="22"/>
-          <w:lang w:val="en-US"/>
-        </w:rPr>
-        <w:t>→</w:t>
+        <w:t xml:space="preserve"> →</w:t>
       </w:r>
       <w:r>
         <w:rPr>
@@ -2961,20 +2937,7 @@
           <w:szCs w:val="22"/>
           <w:lang w:val="en-US"/>
         </w:rPr>
-        <w:t xml:space="preserve"> </w:t>
-      </w:r>
-      <w:r>
-        <w:rPr>
-          <w:rFonts w:hint="default" w:ascii="Bodoni MT" w:hAnsi="Bodoni MT" w:eastAsia="等线" w:cs="Bodoni MT"/>
-          <w:b w:val="0"/>
-          <w:bCs w:val="0"/>
-          <w:i w:val="0"/>
-          <w:iCs w:val="0"/>
-          <w:sz w:val="22"/>
-          <w:szCs w:val="22"/>
-          <w:lang w:val="en-US"/>
-        </w:rPr>
-        <w:t>→</w:t>
+        <w:t xml:space="preserve"> →</w:t>
       </w:r>
       <w:r>
         <w:rPr>
@@ -3700,7 +3663,42 @@
           <w:szCs w:val="22"/>
           <w:lang w:val="en-US"/>
         </w:rPr>
-        <w:t>com.xyz..service.*.*(..)</w:t>
+        <w:t>com.xyz</w:t>
+      </w:r>
+      <w:r>
+        <w:rPr>
+          <w:rFonts w:hint="default" w:ascii="Bodoni MT" w:hAnsi="Bodoni MT" w:eastAsia="等线" w:cs="Bodoni MT"/>
+          <w:b/>
+          <w:bCs/>
+          <w:color w:val="C00000"/>
+          <w:sz w:val="22"/>
+          <w:szCs w:val="22"/>
+          <w:lang w:val="en-US"/>
+        </w:rPr>
+        <w:t>..</w:t>
+      </w:r>
+      <w:r>
+        <w:rPr>
+          <w:rFonts w:hint="default" w:ascii="Bodoni MT" w:hAnsi="Bodoni MT" w:eastAsia="等线" w:cs="Bodoni MT"/>
+          <w:b/>
+          <w:bCs/>
+          <w:color w:val="auto"/>
+          <w:sz w:val="22"/>
+          <w:szCs w:val="22"/>
+          <w:lang w:val="en-US"/>
+        </w:rPr>
+        <w:t>s</w:t>
+      </w:r>
+      <w:r>
+        <w:rPr>
+          <w:rFonts w:hint="default" w:ascii="Bodoni MT" w:hAnsi="Bodoni MT" w:eastAsia="等线" w:cs="Bodoni MT"/>
+          <w:b/>
+          <w:bCs/>
+          <w:sz w:val="22"/>
+          <w:szCs w:val="22"/>
+          <w:lang w:val="en-US"/>
+        </w:rPr>
+        <w:t>ervice.*.*(..)</w:t>
       </w:r>
       <w:r>
         <w:rPr>
@@ -3935,7 +3933,28 @@
           <w:sz w:val="22"/>
           <w:szCs w:val="22"/>
         </w:rPr>
-        <w:t>com.xyz.*.service.*.*(..)</w:t>
+        <w:t>com.xyz</w:t>
+      </w:r>
+      <w:r>
+        <w:rPr>
+          <w:rFonts w:hint="default" w:ascii="Bodoni MT" w:hAnsi="Bodoni MT" w:eastAsia="等线" w:cs="Bodoni MT"/>
+          <w:b/>
+          <w:bCs/>
+          <w:color w:val="C00000"/>
+          <w:sz w:val="22"/>
+          <w:szCs w:val="22"/>
+        </w:rPr>
+        <w:t>.*</w:t>
+      </w:r>
+      <w:r>
+        <w:rPr>
+          <w:rFonts w:hint="default" w:ascii="Bodoni MT" w:hAnsi="Bodoni MT" w:eastAsia="等线" w:cs="Bodoni MT"/>
+          <w:b/>
+          <w:bCs/>
+          <w:sz w:val="22"/>
+          <w:szCs w:val="22"/>
+        </w:rPr>
+        <w:t>.service.*.*(..)</w:t>
       </w:r>
       <w:r>
         <w:rPr>
@@ -4201,6 +4220,7 @@
         <w:keepLines w:val="0"/>
         <w:widowControl/>
         <w:numPr>
+          <w:ilvl w:val="0"/>
           <w:numId w:val="0"/>
         </w:numPr>
         <w:suppressLineNumbers w:val="0"/>
@@ -4364,16 +4384,7 @@
           <w:szCs w:val="22"/>
           <w:lang w:val="en-IN"/>
         </w:rPr>
-        <w:t xml:space="preserve">It </w:t>
-      </w:r>
-      <w:r>
-        <w:rPr>
-          <w:rFonts w:hint="default" w:ascii="Bodoni MT" w:hAnsi="Bodoni MT" w:eastAsia="等线" w:cs="Bodoni MT"/>
-          <w:sz w:val="22"/>
-          <w:szCs w:val="22"/>
-          <w:lang w:val="en-IN"/>
-        </w:rPr>
-        <w:t xml:space="preserve">is a proxy built into </w:t>
+        <w:t xml:space="preserve">It is a proxy built into </w:t>
       </w:r>
       <w:r>
         <w:rPr>
@@ -5371,6 +5382,31 @@
     </w:p>
     <w:p>
       <w:pPr>
+        <w:rPr>
+          <w:rFonts w:hint="default" w:ascii="Bodoni MT" w:hAnsi="Bodoni MT" w:eastAsia="等线" w:cs="Bodoni MT"/>
+          <w:color w:val="002060"/>
+          <w:sz w:val="22"/>
+          <w:szCs w:val="22"/>
+          <w:highlight w:val="lightGray"/>
+        </w:rPr>
+      </w:pPr>
+      <w:r>
+        <w:rPr>
+          <w:rFonts w:hint="default" w:ascii="Bodoni MT" w:hAnsi="Bodoni MT" w:eastAsia="等线" w:cs="Bodoni MT"/>
+          <w:b/>
+          <w:bCs/>
+          <w:color w:val="002060"/>
+          <w:sz w:val="22"/>
+          <w:szCs w:val="22"/>
+          <w:highlight w:val="lightGray"/>
+          <w:u w:val="single"/>
+          <w:lang w:val="en-IN"/>
+        </w:rPr>
+        <w:br w:type="page"/>
+      </w:r>
+    </w:p>
+    <w:p>
+      <w:pPr>
         <w:keepNext w:val="0"/>
         <w:keepLines w:val="0"/>
         <w:widowControl/>
@@ -5681,8 +5717,8 @@
         </w:rPr>
         <w:drawing>
           <wp:inline distT="0" distB="0" distL="114300" distR="114300">
-            <wp:extent cx="5273040" cy="3727450"/>
-            <wp:effectExtent l="0" t="0" r="10160" b="6350"/>
+            <wp:extent cx="4628515" cy="3272155"/>
+            <wp:effectExtent l="0" t="0" r="6985" b="4445"/>
             <wp:docPr id="28" name="Picture 19"/>
             <wp:cNvGraphicFramePr>
               <a:graphicFrameLocks xmlns:a="http://schemas.openxmlformats.org/drawingml/2006/main" noChangeAspect="1"/>
@@ -5705,7 +5741,7 @@
                   <pic:spPr>
                     <a:xfrm>
                       <a:off x="0" y="0"/>
-                      <a:ext cx="5273040" cy="3727450"/>
+                      <a:ext cx="4628515" cy="3272155"/>
                     </a:xfrm>
                     <a:prstGeom prst="rect">
                       <a:avLst/>
@@ -5776,8 +5812,8 @@
         </w:rPr>
         <w:drawing>
           <wp:inline distT="0" distB="0" distL="114300" distR="114300">
-            <wp:extent cx="3204845" cy="1125220"/>
-            <wp:effectExtent l="0" t="0" r="8255" b="5080"/>
+            <wp:extent cx="3014345" cy="1058545"/>
+            <wp:effectExtent l="0" t="0" r="8255" b="8255"/>
             <wp:docPr id="29" name="Picture 20"/>
             <wp:cNvGraphicFramePr>
               <a:graphicFrameLocks xmlns:a="http://schemas.openxmlformats.org/drawingml/2006/main" noChangeAspect="1"/>
@@ -5800,7 +5836,7 @@
                   <pic:spPr>
                     <a:xfrm>
                       <a:off x="0" y="0"/>
-                      <a:ext cx="3204845" cy="1125220"/>
+                      <a:ext cx="3014345" cy="1058545"/>
                     </a:xfrm>
                     <a:prstGeom prst="rect">
                       <a:avLst/>
@@ -5871,8 +5907,8 @@
         </w:rPr>
         <w:drawing>
           <wp:inline distT="0" distB="0" distL="114300" distR="114300">
-            <wp:extent cx="4601845" cy="1629410"/>
-            <wp:effectExtent l="0" t="0" r="8255" b="8890"/>
+            <wp:extent cx="3898265" cy="1380490"/>
+            <wp:effectExtent l="0" t="0" r="635" b="3810"/>
             <wp:docPr id="30" name="Picture 21"/>
             <wp:cNvGraphicFramePr>
               <a:graphicFrameLocks xmlns:a="http://schemas.openxmlformats.org/drawingml/2006/main" noChangeAspect="1"/>
@@ -5895,7 +5931,7 @@
                   <pic:spPr>
                     <a:xfrm>
                       <a:off x="0" y="0"/>
-                      <a:ext cx="4601845" cy="1629410"/>
+                      <a:ext cx="3898265" cy="1380490"/>
                     </a:xfrm>
                     <a:prstGeom prst="rect">
                       <a:avLst/>
@@ -6139,6 +6175,7 @@
         <w:keepLines w:val="0"/>
         <w:widowControl/>
         <w:numPr>
+          <w:ilvl w:val="0"/>
           <w:numId w:val="0"/>
         </w:numPr>
         <w:suppressLineNumbers w:val="0"/>
@@ -8268,6 +8305,7 @@
           <w:rFonts w:hint="default" w:ascii="Bodoni MT" w:hAnsi="Bodoni MT" w:eastAsia="等线" w:cs="Bodoni MT"/>
           <w:b/>
           <w:bCs/>
+          <w:color w:val="C00000"/>
           <w:sz w:val="22"/>
           <w:szCs w:val="22"/>
         </w:rPr>
@@ -8277,6 +8315,7 @@
           <w:rFonts w:hint="default" w:ascii="Bodoni MT" w:hAnsi="Bodoni MT" w:eastAsia="等线" w:cs="Bodoni MT"/>
           <w:b/>
           <w:bCs/>
+          <w:color w:val="C00000"/>
           <w:sz w:val="22"/>
           <w:szCs w:val="22"/>
         </w:rPr>
@@ -8298,13 +8337,15 @@
         <w:jc w:val="left"/>
         <w:rPr>
           <w:rFonts w:hint="default" w:ascii="Bodoni MT" w:hAnsi="Bodoni MT" w:eastAsia="等线" w:cs="Bodoni MT"/>
-          <w:sz w:val="22"/>
-          <w:szCs w:val="22"/>
-        </w:rPr>
-      </w:pPr>
-      <w:r>
-        <w:rPr>
-          <w:rFonts w:hint="default" w:ascii="Bodoni MT" w:hAnsi="Bodoni MT" w:eastAsia="等线" w:cs="Bodoni MT"/>
+          <w:color w:val="C00000"/>
+          <w:sz w:val="22"/>
+          <w:szCs w:val="22"/>
+        </w:rPr>
+      </w:pPr>
+      <w:r>
+        <w:rPr>
+          <w:rFonts w:hint="default" w:ascii="Bodoni MT" w:hAnsi="Bodoni MT" w:eastAsia="等线" w:cs="Bodoni MT"/>
+          <w:color w:val="C00000"/>
           <w:sz w:val="22"/>
           <w:szCs w:val="22"/>
           <w:lang w:val="en-US"/>
@@ -8328,6 +8369,8 @@
         </w:rPr>
         <w:br w:type="page"/>
       </w:r>
+      <w:bookmarkStart w:id="0" w:name="_GoBack"/>
+      <w:bookmarkEnd w:id="0"/>
     </w:p>
     <w:p>
       <w:pPr>
@@ -8335,6 +8378,7 @@
         <w:keepLines w:val="0"/>
         <w:widowControl/>
         <w:numPr>
+          <w:ilvl w:val="0"/>
           <w:numId w:val="0"/>
         </w:numPr>
         <w:suppressLineNumbers w:val="0"/>
@@ -9258,6 +9302,7 @@
         <w:keepLines w:val="0"/>
         <w:widowControl/>
         <w:numPr>
+          <w:ilvl w:val="0"/>
           <w:numId w:val="0"/>
         </w:numPr>
         <w:suppressLineNumbers w:val="0"/>
@@ -10597,6 +10642,14 @@
           <w:lang w:val="en-US"/>
         </w:rPr>
         <w:tab/>
+      </w:r>
+      <w:r>
+        <w:rPr>
+          <w:rFonts w:hint="default" w:ascii="Bodoni MT" w:hAnsi="Bodoni MT" w:eastAsia="等线" w:cs="Bodoni MT"/>
+          <w:sz w:val="22"/>
+          <w:szCs w:val="22"/>
+          <w:lang w:val="en-US"/>
+        </w:rPr>
         <w:t>Aspects are woven into the code during the compilation process.</w:t>
       </w:r>
     </w:p>
@@ -10645,6 +10698,14 @@
           <w:lang w:val="en-US"/>
         </w:rPr>
         <w:tab/>
+      </w:r>
+      <w:r>
+        <w:rPr>
+          <w:rFonts w:hint="default" w:ascii="Bodoni MT" w:hAnsi="Bodoni MT" w:eastAsia="等线" w:cs="Bodoni MT"/>
+          <w:sz w:val="22"/>
+          <w:szCs w:val="22"/>
+          <w:lang w:val="en-US"/>
+        </w:rPr>
         <w:t>Aspects are woven when the class is loaded into the JVM.</w:t>
       </w:r>
     </w:p>
@@ -10693,6 +10754,14 @@
           <w:lang w:val="en-US"/>
         </w:rPr>
         <w:tab/>
+      </w:r>
+      <w:r>
+        <w:rPr>
+          <w:rFonts w:hint="default" w:ascii="Bodoni MT" w:hAnsi="Bodoni MT" w:eastAsia="等线" w:cs="Bodoni MT"/>
+          <w:sz w:val="22"/>
+          <w:szCs w:val="22"/>
+          <w:lang w:val="en-US"/>
+        </w:rPr>
         <w:t>Aspects are woven after the classes have been compiled.</w:t>
       </w:r>
     </w:p>
@@ -11331,16 +11400,16 @@
     <w:lsdException w:qFormat="1" w:unhideWhenUsed="0" w:uiPriority="0" w:semiHidden="0" w:name="index 8"/>
     <w:lsdException w:qFormat="1" w:unhideWhenUsed="0" w:uiPriority="0" w:semiHidden="0" w:name="index 9"/>
     <w:lsdException w:qFormat="1" w:unhideWhenUsed="0" w:uiPriority="0" w:semiHidden="0" w:name="toc 1"/>
-    <w:lsdException w:unhideWhenUsed="0" w:uiPriority="0" w:semiHidden="0" w:name="toc 2"/>
+    <w:lsdException w:qFormat="1" w:unhideWhenUsed="0" w:uiPriority="0" w:semiHidden="0" w:name="toc 2"/>
     <w:lsdException w:qFormat="1" w:unhideWhenUsed="0" w:uiPriority="0" w:semiHidden="0" w:name="toc 3"/>
     <w:lsdException w:qFormat="1" w:unhideWhenUsed="0" w:uiPriority="0" w:semiHidden="0" w:name="toc 4"/>
     <w:lsdException w:qFormat="1" w:unhideWhenUsed="0" w:uiPriority="0" w:semiHidden="0" w:name="toc 5"/>
-    <w:lsdException w:unhideWhenUsed="0" w:uiPriority="0" w:semiHidden="0" w:name="toc 6"/>
+    <w:lsdException w:qFormat="1" w:unhideWhenUsed="0" w:uiPriority="0" w:semiHidden="0" w:name="toc 6"/>
     <w:lsdException w:qFormat="1" w:unhideWhenUsed="0" w:uiPriority="0" w:semiHidden="0" w:name="toc 7"/>
     <w:lsdException w:qFormat="1" w:unhideWhenUsed="0" w:uiPriority="0" w:semiHidden="0" w:name="toc 8"/>
     <w:lsdException w:qFormat="1" w:unhideWhenUsed="0" w:uiPriority="0" w:semiHidden="0" w:name="toc 9"/>
     <w:lsdException w:qFormat="1" w:unhideWhenUsed="0" w:uiPriority="0" w:semiHidden="0" w:name="Normal Indent"/>
-    <w:lsdException w:unhideWhenUsed="0" w:uiPriority="0" w:semiHidden="0" w:name="footnote text"/>
+    <w:lsdException w:qFormat="1" w:unhideWhenUsed="0" w:uiPriority="0" w:semiHidden="0" w:name="footnote text"/>
     <w:lsdException w:qFormat="1" w:unhideWhenUsed="0" w:uiPriority="0" w:semiHidden="0" w:name="annotation text"/>
     <w:lsdException w:qFormat="1" w:unhideWhenUsed="0" w:uiPriority="0" w:semiHidden="0" w:name="header"/>
     <w:lsdException w:qFormat="1" w:unhideWhenUsed="0" w:uiPriority="0" w:semiHidden="0" w:name="footer"/>
@@ -11357,7 +11426,7 @@
     <w:lsdException w:qFormat="1" w:unhideWhenUsed="0" w:uiPriority="0" w:semiHidden="0" w:name="endnote text"/>
     <w:lsdException w:qFormat="1" w:unhideWhenUsed="0" w:uiPriority="0" w:semiHidden="0" w:name="table of authorities"/>
     <w:lsdException w:qFormat="1" w:unhideWhenUsed="0" w:uiPriority="0" w:semiHidden="0" w:name="macro"/>
-    <w:lsdException w:unhideWhenUsed="0" w:uiPriority="0" w:semiHidden="0" w:name="toa heading"/>
+    <w:lsdException w:qFormat="1" w:unhideWhenUsed="0" w:uiPriority="0" w:semiHidden="0" w:name="toa heading"/>
     <w:lsdException w:qFormat="1" w:unhideWhenUsed="0" w:uiPriority="0" w:semiHidden="0" w:name="List"/>
     <w:lsdException w:qFormat="1" w:unhideWhenUsed="0" w:uiPriority="0" w:semiHidden="0" w:name="List Bullet"/>
     <w:lsdException w:qFormat="1" w:unhideWhenUsed="0" w:uiPriority="0" w:semiHidden="0" w:name="List Number"/>
@@ -11380,7 +11449,7 @@
     <w:lsdException w:qFormat="1" w:unhideWhenUsed="0" w:uiPriority="0" w:semiHidden="0" w:name="Body Text"/>
     <w:lsdException w:qFormat="1" w:unhideWhenUsed="0" w:uiPriority="0" w:semiHidden="0" w:name="Body Text Indent"/>
     <w:lsdException w:qFormat="1" w:unhideWhenUsed="0" w:uiPriority="0" w:semiHidden="0" w:name="List Continue"/>
-    <w:lsdException w:unhideWhenUsed="0" w:uiPriority="0" w:semiHidden="0" w:name="List Continue 2"/>
+    <w:lsdException w:qFormat="1" w:unhideWhenUsed="0" w:uiPriority="0" w:semiHidden="0" w:name="List Continue 2"/>
     <w:lsdException w:qFormat="1" w:unhideWhenUsed="0" w:uiPriority="0" w:semiHidden="0" w:name="List Continue 3"/>
     <w:lsdException w:qFormat="1" w:unhideWhenUsed="0" w:uiPriority="0" w:semiHidden="0" w:name="List Continue 4"/>
     <w:lsdException w:qFormat="1" w:unhideWhenUsed="0" w:uiPriority="0" w:semiHidden="0" w:name="List Continue 5"/>
@@ -11391,7 +11460,7 @@
     <w:lsdException w:qFormat="1" w:unhideWhenUsed="0" w:uiPriority="0" w:semiHidden="0" w:name="Body Text First Indent"/>
     <w:lsdException w:qFormat="1" w:unhideWhenUsed="0" w:uiPriority="0" w:semiHidden="0" w:name="Body Text First Indent 2"/>
     <w:lsdException w:qFormat="1" w:unhideWhenUsed="0" w:uiPriority="0" w:semiHidden="0" w:name="Note Heading"/>
-    <w:lsdException w:unhideWhenUsed="0" w:uiPriority="0" w:semiHidden="0" w:name="Body Text 2"/>
+    <w:lsdException w:qFormat="1" w:unhideWhenUsed="0" w:uiPriority="0" w:semiHidden="0" w:name="Body Text 2"/>
     <w:lsdException w:qFormat="1" w:unhideWhenUsed="0" w:uiPriority="0" w:semiHidden="0" w:name="Body Text 3"/>
     <w:lsdException w:qFormat="1" w:unhideWhenUsed="0" w:uiPriority="0" w:semiHidden="0" w:name="Body Text Indent 2"/>
     <w:lsdException w:qFormat="1" w:unhideWhenUsed="0" w:uiPriority="0" w:semiHidden="0" w:name="Body Text Indent 3"/>
@@ -11404,7 +11473,7 @@
     <w:lsdException w:unhideWhenUsed="0" w:uiPriority="0" w:semiHidden="0" w:name="Plain Text"/>
     <w:lsdException w:qFormat="1" w:unhideWhenUsed="0" w:uiPriority="0" w:semiHidden="0" w:name="E-mail Signature"/>
     <w:lsdException w:qFormat="1" w:unhideWhenUsed="0" w:uiPriority="0" w:semiHidden="0" w:name="Normal (Web)"/>
-    <w:lsdException w:unhideWhenUsed="0" w:uiPriority="0" w:semiHidden="0" w:name="HTML Acronym"/>
+    <w:lsdException w:qFormat="1" w:unhideWhenUsed="0" w:uiPriority="0" w:semiHidden="0" w:name="HTML Acronym"/>
     <w:lsdException w:qFormat="1" w:unhideWhenUsed="0" w:uiPriority="0" w:semiHidden="0" w:name="HTML Address"/>
     <w:lsdException w:qFormat="1" w:unhideWhenUsed="0" w:uiPriority="0" w:semiHidden="0" w:name="HTML Cite"/>
     <w:lsdException w:qFormat="1" w:unhideWhenUsed="0" w:uiPriority="0" w:semiHidden="0" w:name="HTML Code"/>
@@ -11416,42 +11485,42 @@
     <w:lsdException w:qFormat="1" w:unhideWhenUsed="0" w:uiPriority="0" w:semiHidden="0" w:name="HTML Variable"/>
     <w:lsdException w:unhideWhenUsed="0" w:uiPriority="0" w:name="Normal Table"/>
     <w:lsdException w:qFormat="1" w:unhideWhenUsed="0" w:uiPriority="0" w:semiHidden="0" w:name="annotation subject"/>
-    <w:lsdException w:unhideWhenUsed="0" w:uiPriority="0" w:semiHidden="0" w:name="Table Simple 1"/>
+    <w:lsdException w:qFormat="1" w:unhideWhenUsed="0" w:uiPriority="0" w:semiHidden="0" w:name="Table Simple 1"/>
     <w:lsdException w:qFormat="1" w:unhideWhenUsed="0" w:uiPriority="0" w:semiHidden="0" w:name="Table Simple 2"/>
     <w:lsdException w:qFormat="1" w:unhideWhenUsed="0" w:uiPriority="0" w:semiHidden="0" w:name="Table Simple 3"/>
     <w:lsdException w:qFormat="1" w:unhideWhenUsed="0" w:uiPriority="0" w:semiHidden="0" w:name="Table Classic 1"/>
-    <w:lsdException w:unhideWhenUsed="0" w:uiPriority="0" w:semiHidden="0" w:name="Table Classic 2"/>
+    <w:lsdException w:qFormat="1" w:unhideWhenUsed="0" w:uiPriority="0" w:semiHidden="0" w:name="Table Classic 2"/>
     <w:lsdException w:qFormat="1" w:unhideWhenUsed="0" w:uiPriority="0" w:semiHidden="0" w:name="Table Classic 3"/>
-    <w:lsdException w:unhideWhenUsed="0" w:uiPriority="0" w:semiHidden="0" w:name="Table Classic 4"/>
-    <w:lsdException w:unhideWhenUsed="0" w:uiPriority="0" w:semiHidden="0" w:name="Table Colorful 1"/>
+    <w:lsdException w:qFormat="1" w:unhideWhenUsed="0" w:uiPriority="0" w:semiHidden="0" w:name="Table Classic 4"/>
+    <w:lsdException w:qFormat="1" w:unhideWhenUsed="0" w:uiPriority="0" w:semiHidden="0" w:name="Table Colorful 1"/>
     <w:lsdException w:qFormat="1" w:unhideWhenUsed="0" w:uiPriority="0" w:semiHidden="0" w:name="Table Colorful 2"/>
     <w:lsdException w:qFormat="1" w:unhideWhenUsed="0" w:uiPriority="0" w:semiHidden="0" w:name="Table Colorful 3"/>
     <w:lsdException w:qFormat="1" w:unhideWhenUsed="0" w:uiPriority="0" w:semiHidden="0" w:name="Table Columns 1"/>
     <w:lsdException w:qFormat="1" w:unhideWhenUsed="0" w:uiPriority="0" w:semiHidden="0" w:name="Table Columns 2"/>
     <w:lsdException w:qFormat="1" w:unhideWhenUsed="0" w:uiPriority="0" w:semiHidden="0" w:name="Table Columns 3"/>
     <w:lsdException w:qFormat="1" w:unhideWhenUsed="0" w:uiPriority="0" w:semiHidden="0" w:name="Table Columns 4"/>
-    <w:lsdException w:unhideWhenUsed="0" w:uiPriority="0" w:semiHidden="0" w:name="Table Columns 5"/>
+    <w:lsdException w:qFormat="1" w:unhideWhenUsed="0" w:uiPriority="0" w:semiHidden="0" w:name="Table Columns 5"/>
     <w:lsdException w:qFormat="1" w:unhideWhenUsed="0" w:uiPriority="0" w:semiHidden="0" w:name="Table Grid 1"/>
     <w:lsdException w:qFormat="1" w:unhideWhenUsed="0" w:uiPriority="0" w:semiHidden="0" w:name="Table Grid 2"/>
-    <w:lsdException w:unhideWhenUsed="0" w:uiPriority="0" w:semiHidden="0" w:name="Table Grid 3"/>
+    <w:lsdException w:qFormat="1" w:unhideWhenUsed="0" w:uiPriority="0" w:semiHidden="0" w:name="Table Grid 3"/>
     <w:lsdException w:qFormat="1" w:unhideWhenUsed="0" w:uiPriority="0" w:semiHidden="0" w:name="Table Grid 4"/>
-    <w:lsdException w:unhideWhenUsed="0" w:uiPriority="0" w:semiHidden="0" w:name="Table Grid 5"/>
-    <w:lsdException w:unhideWhenUsed="0" w:uiPriority="0" w:semiHidden="0" w:name="Table Grid 6"/>
-    <w:lsdException w:unhideWhenUsed="0" w:uiPriority="0" w:semiHidden="0" w:name="Table Grid 7"/>
-    <w:lsdException w:unhideWhenUsed="0" w:uiPriority="0" w:semiHidden="0" w:name="Table Grid 8"/>
-    <w:lsdException w:unhideWhenUsed="0" w:uiPriority="0" w:semiHidden="0" w:name="Table List 1"/>
+    <w:lsdException w:qFormat="1" w:unhideWhenUsed="0" w:uiPriority="0" w:semiHidden="0" w:name="Table Grid 5"/>
+    <w:lsdException w:qFormat="1" w:unhideWhenUsed="0" w:uiPriority="0" w:semiHidden="0" w:name="Table Grid 6"/>
+    <w:lsdException w:qFormat="1" w:unhideWhenUsed="0" w:uiPriority="0" w:semiHidden="0" w:name="Table Grid 7"/>
+    <w:lsdException w:qFormat="1" w:unhideWhenUsed="0" w:uiPriority="0" w:semiHidden="0" w:name="Table Grid 8"/>
+    <w:lsdException w:qFormat="1" w:unhideWhenUsed="0" w:uiPriority="0" w:semiHidden="0" w:name="Table List 1"/>
     <w:lsdException w:qFormat="1" w:unhideWhenUsed="0" w:uiPriority="0" w:semiHidden="0" w:name="Table List 2"/>
     <w:lsdException w:qFormat="1" w:unhideWhenUsed="0" w:uiPriority="0" w:semiHidden="0" w:name="Table List 3"/>
-    <w:lsdException w:unhideWhenUsed="0" w:uiPriority="0" w:semiHidden="0" w:name="Table List 4"/>
+    <w:lsdException w:qFormat="1" w:unhideWhenUsed="0" w:uiPriority="0" w:semiHidden="0" w:name="Table List 4"/>
     <w:lsdException w:qFormat="1" w:unhideWhenUsed="0" w:uiPriority="0" w:semiHidden="0" w:name="Table List 5"/>
     <w:lsdException w:qFormat="1" w:unhideWhenUsed="0" w:uiPriority="0" w:semiHidden="0" w:name="Table List 6"/>
     <w:lsdException w:qFormat="1" w:unhideWhenUsed="0" w:uiPriority="0" w:semiHidden="0" w:name="Table List 7"/>
-    <w:lsdException w:unhideWhenUsed="0" w:uiPriority="0" w:semiHidden="0" w:name="Table List 8"/>
+    <w:lsdException w:qFormat="1" w:unhideWhenUsed="0" w:uiPriority="0" w:semiHidden="0" w:name="Table List 8"/>
     <w:lsdException w:unhideWhenUsed="0" w:uiPriority="0" w:semiHidden="0" w:name="Table 3D effects 1"/>
     <w:lsdException w:qFormat="1" w:unhideWhenUsed="0" w:uiPriority="0" w:semiHidden="0" w:name="Table 3D effects 2"/>
     <w:lsdException w:qFormat="1" w:unhideWhenUsed="0" w:uiPriority="0" w:semiHidden="0" w:name="Table 3D effects 3"/>
     <w:lsdException w:qFormat="1" w:unhideWhenUsed="0" w:uiPriority="0" w:semiHidden="0" w:name="Table Contemporary"/>
-    <w:lsdException w:unhideWhenUsed="0" w:uiPriority="0" w:semiHidden="0" w:name="Table Elegant"/>
+    <w:lsdException w:qFormat="1" w:unhideWhenUsed="0" w:uiPriority="0" w:semiHidden="0" w:name="Table Elegant"/>
     <w:lsdException w:qFormat="1" w:unhideWhenUsed="0" w:uiPriority="0" w:semiHidden="0" w:name="Table Professional"/>
     <w:lsdException w:qFormat="1" w:unhideWhenUsed="0" w:uiPriority="0" w:semiHidden="0" w:name="Table Subtle 1"/>
     <w:lsdException w:qFormat="1" w:unhideWhenUsed="0" w:uiPriority="0" w:semiHidden="0" w:name="Table Subtle 2"/>
@@ -11463,28 +11532,28 @@
     <w:lsdException w:qFormat="1" w:unhideWhenUsed="0" w:uiPriority="0" w:semiHidden="0" w:name="Table Theme"/>
     <w:lsdException w:qFormat="1" w:unhideWhenUsed="0" w:uiPriority="60" w:semiHidden="0" w:name="Light Shading"/>
     <w:lsdException w:qFormat="1" w:unhideWhenUsed="0" w:uiPriority="61" w:semiHidden="0" w:name="Light List"/>
-    <w:lsdException w:unhideWhenUsed="0" w:uiPriority="62" w:semiHidden="0" w:name="Light Grid"/>
+    <w:lsdException w:qFormat="1" w:unhideWhenUsed="0" w:uiPriority="62" w:semiHidden="0" w:name="Light Grid"/>
     <w:lsdException w:qFormat="1" w:unhideWhenUsed="0" w:uiPriority="63" w:semiHidden="0" w:name="Medium Shading 1"/>
     <w:lsdException w:qFormat="1" w:unhideWhenUsed="0" w:uiPriority="64" w:semiHidden="0" w:name="Medium Shading 2"/>
     <w:lsdException w:qFormat="1" w:unhideWhenUsed="0" w:uiPriority="65" w:semiHidden="0" w:name="Medium List 1"/>
-    <w:lsdException w:unhideWhenUsed="0" w:uiPriority="66" w:semiHidden="0" w:name="Medium List 2"/>
-    <w:lsdException w:unhideWhenUsed="0" w:uiPriority="67" w:semiHidden="0" w:name="Medium Grid 1"/>
-    <w:lsdException w:unhideWhenUsed="0" w:uiPriority="68" w:semiHidden="0" w:name="Medium Grid 2"/>
-    <w:lsdException w:unhideWhenUsed="0" w:uiPriority="69" w:semiHidden="0" w:name="Medium Grid 3"/>
+    <w:lsdException w:qFormat="1" w:unhideWhenUsed="0" w:uiPriority="66" w:semiHidden="0" w:name="Medium List 2"/>
+    <w:lsdException w:qFormat="1" w:unhideWhenUsed="0" w:uiPriority="67" w:semiHidden="0" w:name="Medium Grid 1"/>
+    <w:lsdException w:qFormat="1" w:unhideWhenUsed="0" w:uiPriority="68" w:semiHidden="0" w:name="Medium Grid 2"/>
+    <w:lsdException w:qFormat="1" w:unhideWhenUsed="0" w:uiPriority="69" w:semiHidden="0" w:name="Medium Grid 3"/>
     <w:lsdException w:unhideWhenUsed="0" w:uiPriority="70" w:semiHidden="0" w:name="Dark List"/>
     <w:lsdException w:unhideWhenUsed="0" w:uiPriority="71" w:semiHidden="0" w:name="Colorful Shading"/>
-    <w:lsdException w:unhideWhenUsed="0" w:uiPriority="72" w:semiHidden="0" w:name="Colorful List"/>
+    <w:lsdException w:qFormat="1" w:unhideWhenUsed="0" w:uiPriority="72" w:semiHidden="0" w:name="Colorful List"/>
     <w:lsdException w:qFormat="1" w:unhideWhenUsed="0" w:uiPriority="73" w:semiHidden="0" w:name="Colorful Grid"/>
-    <w:lsdException w:unhideWhenUsed="0" w:uiPriority="60" w:semiHidden="0" w:name="Light Shading Accent 1"/>
-    <w:lsdException w:unhideWhenUsed="0" w:uiPriority="61" w:semiHidden="0" w:name="Light List Accent 1"/>
+    <w:lsdException w:qFormat="1" w:unhideWhenUsed="0" w:uiPriority="60" w:semiHidden="0" w:name="Light Shading Accent 1"/>
+    <w:lsdException w:qFormat="1" w:unhideWhenUsed="0" w:uiPriority="61" w:semiHidden="0" w:name="Light List Accent 1"/>
     <w:lsdException w:unhideWhenUsed="0" w:uiPriority="62" w:semiHidden="0" w:name="Light Grid Accent 1"/>
-    <w:lsdException w:unhideWhenUsed="0" w:uiPriority="63" w:semiHidden="0" w:name="Medium Shading 1 Accent 1"/>
+    <w:lsdException w:qFormat="1" w:unhideWhenUsed="0" w:uiPriority="63" w:semiHidden="0" w:name="Medium Shading 1 Accent 1"/>
     <w:lsdException w:qFormat="1" w:unhideWhenUsed="0" w:uiPriority="64" w:semiHidden="0" w:name="Medium Shading 2 Accent 1"/>
     <w:lsdException w:qFormat="1" w:unhideWhenUsed="0" w:uiPriority="65" w:semiHidden="0" w:name="Medium List 1 Accent 1"/>
-    <w:lsdException w:unhideWhenUsed="0" w:uiPriority="66" w:semiHidden="0" w:name="Medium List 2 Accent 1"/>
-    <w:lsdException w:unhideWhenUsed="0" w:uiPriority="67" w:semiHidden="0" w:name="Medium Grid 1 Accent 1"/>
-    <w:lsdException w:unhideWhenUsed="0" w:uiPriority="68" w:semiHidden="0" w:name="Medium Grid 2 Accent 1"/>
-    <w:lsdException w:unhideWhenUsed="0" w:uiPriority="69" w:semiHidden="0" w:name="Medium Grid 3 Accent 1"/>
+    <w:lsdException w:qFormat="1" w:unhideWhenUsed="0" w:uiPriority="66" w:semiHidden="0" w:name="Medium List 2 Accent 1"/>
+    <w:lsdException w:qFormat="1" w:unhideWhenUsed="0" w:uiPriority="67" w:semiHidden="0" w:name="Medium Grid 1 Accent 1"/>
+    <w:lsdException w:qFormat="1" w:unhideWhenUsed="0" w:uiPriority="68" w:semiHidden="0" w:name="Medium Grid 2 Accent 1"/>
+    <w:lsdException w:qFormat="1" w:unhideWhenUsed="0" w:uiPriority="69" w:semiHidden="0" w:name="Medium Grid 3 Accent 1"/>
     <w:lsdException w:qFormat="1" w:unhideWhenUsed="0" w:uiPriority="70" w:semiHidden="0" w:name="Dark List Accent 1"/>
     <w:lsdException w:unhideWhenUsed="0" w:uiPriority="71" w:semiHidden="0" w:name="Colorful Shading Accent 1"/>
     <w:lsdException w:unhideWhenUsed="0" w:uiPriority="72" w:semiHidden="0" w:name="Colorful List Accent 1"/>
@@ -11496,46 +11565,46 @@
     <w:lsdException w:qFormat="1" w:unhideWhenUsed="0" w:uiPriority="64" w:semiHidden="0" w:name="Medium Shading 2 Accent 2"/>
     <w:lsdException w:qFormat="1" w:unhideWhenUsed="0" w:uiPriority="65" w:semiHidden="0" w:name="Medium List 1 Accent 2"/>
     <w:lsdException w:qFormat="1" w:unhideWhenUsed="0" w:uiPriority="66" w:semiHidden="0" w:name="Medium List 2 Accent 2"/>
-    <w:lsdException w:unhideWhenUsed="0" w:uiPriority="67" w:semiHidden="0" w:name="Medium Grid 1 Accent 2"/>
-    <w:lsdException w:unhideWhenUsed="0" w:uiPriority="68" w:semiHidden="0" w:name="Medium Grid 2 Accent 2"/>
+    <w:lsdException w:qFormat="1" w:unhideWhenUsed="0" w:uiPriority="67" w:semiHidden="0" w:name="Medium Grid 1 Accent 2"/>
+    <w:lsdException w:qFormat="1" w:unhideWhenUsed="0" w:uiPriority="68" w:semiHidden="0" w:name="Medium Grid 2 Accent 2"/>
     <w:lsdException w:qFormat="1" w:unhideWhenUsed="0" w:uiPriority="69" w:semiHidden="0" w:name="Medium Grid 3 Accent 2"/>
     <w:lsdException w:qFormat="1" w:unhideWhenUsed="0" w:uiPriority="70" w:semiHidden="0" w:name="Dark List Accent 2"/>
-    <w:lsdException w:unhideWhenUsed="0" w:uiPriority="71" w:semiHidden="0" w:name="Colorful Shading Accent 2"/>
-    <w:lsdException w:unhideWhenUsed="0" w:uiPriority="72" w:semiHidden="0" w:name="Colorful List Accent 2"/>
+    <w:lsdException w:qFormat="1" w:unhideWhenUsed="0" w:uiPriority="71" w:semiHidden="0" w:name="Colorful Shading Accent 2"/>
+    <w:lsdException w:qFormat="1" w:unhideWhenUsed="0" w:uiPriority="72" w:semiHidden="0" w:name="Colorful List Accent 2"/>
     <w:lsdException w:qFormat="1" w:unhideWhenUsed="0" w:uiPriority="73" w:semiHidden="0" w:name="Colorful Grid Accent 2"/>
     <w:lsdException w:qFormat="1" w:unhideWhenUsed="0" w:uiPriority="60" w:semiHidden="0" w:name="Light Shading Accent 3"/>
-    <w:lsdException w:unhideWhenUsed="0" w:uiPriority="61" w:semiHidden="0" w:name="Light List Accent 3"/>
-    <w:lsdException w:unhideWhenUsed="0" w:uiPriority="62" w:semiHidden="0" w:name="Light Grid Accent 3"/>
-    <w:lsdException w:unhideWhenUsed="0" w:uiPriority="63" w:semiHidden="0" w:name="Medium Shading 1 Accent 3"/>
+    <w:lsdException w:qFormat="1" w:unhideWhenUsed="0" w:uiPriority="61" w:semiHidden="0" w:name="Light List Accent 3"/>
+    <w:lsdException w:qFormat="1" w:unhideWhenUsed="0" w:uiPriority="62" w:semiHidden="0" w:name="Light Grid Accent 3"/>
+    <w:lsdException w:qFormat="1" w:unhideWhenUsed="0" w:uiPriority="63" w:semiHidden="0" w:name="Medium Shading 1 Accent 3"/>
     <w:lsdException w:unhideWhenUsed="0" w:uiPriority="64" w:semiHidden="0" w:name="Medium Shading 2 Accent 3"/>
     <w:lsdException w:qFormat="1" w:unhideWhenUsed="0" w:uiPriority="65" w:semiHidden="0" w:name="Medium List 1 Accent 3"/>
-    <w:lsdException w:unhideWhenUsed="0" w:uiPriority="66" w:semiHidden="0" w:name="Medium List 2 Accent 3"/>
-    <w:lsdException w:unhideWhenUsed="0" w:uiPriority="67" w:semiHidden="0" w:name="Medium Grid 1 Accent 3"/>
-    <w:lsdException w:unhideWhenUsed="0" w:uiPriority="68" w:semiHidden="0" w:name="Medium Grid 2 Accent 3"/>
+    <w:lsdException w:qFormat="1" w:unhideWhenUsed="0" w:uiPriority="66" w:semiHidden="0" w:name="Medium List 2 Accent 3"/>
+    <w:lsdException w:qFormat="1" w:unhideWhenUsed="0" w:uiPriority="67" w:semiHidden="0" w:name="Medium Grid 1 Accent 3"/>
+    <w:lsdException w:qFormat="1" w:unhideWhenUsed="0" w:uiPriority="68" w:semiHidden="0" w:name="Medium Grid 2 Accent 3"/>
     <w:lsdException w:unhideWhenUsed="0" w:uiPriority="69" w:semiHidden="0" w:name="Medium Grid 3 Accent 3"/>
     <w:lsdException w:unhideWhenUsed="0" w:uiPriority="70" w:semiHidden="0" w:name="Dark List Accent 3"/>
     <w:lsdException w:unhideWhenUsed="0" w:uiPriority="71" w:semiHidden="0" w:name="Colorful Shading Accent 3"/>
     <w:lsdException w:unhideWhenUsed="0" w:uiPriority="72" w:semiHidden="0" w:name="Colorful List Accent 3"/>
     <w:lsdException w:unhideWhenUsed="0" w:uiPriority="73" w:semiHidden="0" w:name="Colorful Grid Accent 3"/>
     <w:lsdException w:qFormat="1" w:unhideWhenUsed="0" w:uiPriority="60" w:semiHidden="0" w:name="Light Shading Accent 4"/>
-    <w:lsdException w:unhideWhenUsed="0" w:uiPriority="61" w:semiHidden="0" w:name="Light List Accent 4"/>
-    <w:lsdException w:unhideWhenUsed="0" w:uiPriority="62" w:semiHidden="0" w:name="Light Grid Accent 4"/>
+    <w:lsdException w:qFormat="1" w:unhideWhenUsed="0" w:uiPriority="61" w:semiHidden="0" w:name="Light List Accent 4"/>
+    <w:lsdException w:qFormat="1" w:unhideWhenUsed="0" w:uiPriority="62" w:semiHidden="0" w:name="Light Grid Accent 4"/>
     <w:lsdException w:qFormat="1" w:unhideWhenUsed="0" w:uiPriority="63" w:semiHidden="0" w:name="Medium Shading 1 Accent 4"/>
     <w:lsdException w:qFormat="1" w:unhideWhenUsed="0" w:uiPriority="64" w:semiHidden="0" w:name="Medium Shading 2 Accent 4"/>
     <w:lsdException w:qFormat="1" w:unhideWhenUsed="0" w:uiPriority="65" w:semiHidden="0" w:name="Medium List 1 Accent 4"/>
-    <w:lsdException w:unhideWhenUsed="0" w:uiPriority="66" w:semiHidden="0" w:name="Medium List 2 Accent 4"/>
-    <w:lsdException w:unhideWhenUsed="0" w:uiPriority="67" w:semiHidden="0" w:name="Medium Grid 1 Accent 4"/>
-    <w:lsdException w:unhideWhenUsed="0" w:uiPriority="68" w:semiHidden="0" w:name="Medium Grid 2 Accent 4"/>
+    <w:lsdException w:qFormat="1" w:unhideWhenUsed="0" w:uiPriority="66" w:semiHidden="0" w:name="Medium List 2 Accent 4"/>
+    <w:lsdException w:qFormat="1" w:unhideWhenUsed="0" w:uiPriority="67" w:semiHidden="0" w:name="Medium Grid 1 Accent 4"/>
+    <w:lsdException w:qFormat="1" w:unhideWhenUsed="0" w:uiPriority="68" w:semiHidden="0" w:name="Medium Grid 2 Accent 4"/>
     <w:lsdException w:unhideWhenUsed="0" w:uiPriority="69" w:semiHidden="0" w:name="Medium Grid 3 Accent 4"/>
-    <w:lsdException w:unhideWhenUsed="0" w:uiPriority="70" w:semiHidden="0" w:name="Dark List Accent 4"/>
+    <w:lsdException w:qFormat="1" w:unhideWhenUsed="0" w:uiPriority="70" w:semiHidden="0" w:name="Dark List Accent 4"/>
     <w:lsdException w:unhideWhenUsed="0" w:uiPriority="71" w:semiHidden="0" w:name="Colorful Shading Accent 4"/>
-    <w:lsdException w:unhideWhenUsed="0" w:uiPriority="72" w:semiHidden="0" w:name="Colorful List Accent 4"/>
+    <w:lsdException w:qFormat="1" w:unhideWhenUsed="0" w:uiPriority="72" w:semiHidden="0" w:name="Colorful List Accent 4"/>
     <w:lsdException w:unhideWhenUsed="0" w:uiPriority="73" w:semiHidden="0" w:name="Colorful Grid Accent 4"/>
     <w:lsdException w:qFormat="1" w:unhideWhenUsed="0" w:uiPriority="60" w:semiHidden="0" w:name="Light Shading Accent 5"/>
     <w:lsdException w:qFormat="1" w:unhideWhenUsed="0" w:uiPriority="61" w:semiHidden="0" w:name="Light List Accent 5"/>
     <w:lsdException w:qFormat="1" w:unhideWhenUsed="0" w:uiPriority="62" w:semiHidden="0" w:name="Light Grid Accent 5"/>
-    <w:lsdException w:unhideWhenUsed="0" w:uiPriority="63" w:semiHidden="0" w:name="Medium Shading 1 Accent 5"/>
-    <w:lsdException w:unhideWhenUsed="0" w:uiPriority="64" w:semiHidden="0" w:name="Medium Shading 2 Accent 5"/>
+    <w:lsdException w:qFormat="1" w:unhideWhenUsed="0" w:uiPriority="63" w:semiHidden="0" w:name="Medium Shading 1 Accent 5"/>
+    <w:lsdException w:qFormat="1" w:unhideWhenUsed="0" w:uiPriority="64" w:semiHidden="0" w:name="Medium Shading 2 Accent 5"/>
     <w:lsdException w:qFormat="1" w:unhideWhenUsed="0" w:uiPriority="65" w:semiHidden="0" w:name="Medium List 1 Accent 5"/>
     <w:lsdException w:qFormat="1" w:unhideWhenUsed="0" w:uiPriority="66" w:semiHidden="0" w:name="Medium List 2 Accent 5"/>
     <w:lsdException w:qFormat="1" w:unhideWhenUsed="0" w:uiPriority="67" w:semiHidden="0" w:name="Medium Grid 1 Accent 5"/>
@@ -11551,8 +11620,8 @@
     <w:lsdException w:qFormat="1" w:unhideWhenUsed="0" w:uiPriority="63" w:semiHidden="0" w:name="Medium Shading 1 Accent 6"/>
     <w:lsdException w:qFormat="1" w:unhideWhenUsed="0" w:uiPriority="64" w:semiHidden="0" w:name="Medium Shading 2 Accent 6"/>
     <w:lsdException w:qFormat="1" w:unhideWhenUsed="0" w:uiPriority="65" w:semiHidden="0" w:name="Medium List 1 Accent 6"/>
-    <w:lsdException w:unhideWhenUsed="0" w:uiPriority="66" w:semiHidden="0" w:name="Medium List 2 Accent 6"/>
-    <w:lsdException w:unhideWhenUsed="0" w:uiPriority="67" w:semiHidden="0" w:name="Medium Grid 1 Accent 6"/>
+    <w:lsdException w:qFormat="1" w:unhideWhenUsed="0" w:uiPriority="66" w:semiHidden="0" w:name="Medium List 2 Accent 6"/>
+    <w:lsdException w:qFormat="1" w:unhideWhenUsed="0" w:uiPriority="67" w:semiHidden="0" w:name="Medium Grid 1 Accent 6"/>
     <w:lsdException w:qFormat="1" w:unhideWhenUsed="0" w:uiPriority="68" w:semiHidden="0" w:name="Medium Grid 2 Accent 6"/>
     <w:lsdException w:qFormat="1" w:unhideWhenUsed="0" w:uiPriority="69" w:semiHidden="0" w:name="Medium Grid 3 Accent 6"/>
     <w:lsdException w:unhideWhenUsed="0" w:uiPriority="70" w:semiHidden="0" w:name="Dark List Accent 6"/>
@@ -11805,6 +11874,7 @@
   <w:style w:type="paragraph" w:styleId="16">
     <w:name w:val="Body Text 2"/>
     <w:basedOn w:val="1"/>
+    <w:qFormat/>
     <w:uiPriority w:val="0"/>
     <w:pPr>
       <w:spacing w:after="120" w:line="480" w:lineRule="auto"/>
@@ -12049,6 +12119,7 @@
   <w:style w:type="paragraph" w:styleId="39">
     <w:name w:val="footnote text"/>
     <w:basedOn w:val="1"/>
+    <w:qFormat/>
     <w:uiPriority w:val="0"/>
     <w:pPr>
       <w:snapToGrid w:val="0"/>
@@ -12079,6 +12150,7 @@
   <w:style w:type="character" w:styleId="41">
     <w:name w:val="HTML Acronym"/>
     <w:basedOn w:val="11"/>
+    <w:qFormat/>
     <w:uiPriority w:val="0"/>
   </w:style>
   <w:style w:type="paragraph" w:styleId="42">
@@ -12406,6 +12478,7 @@
   <w:style w:type="paragraph" w:styleId="74">
     <w:name w:val="List Continue 2"/>
     <w:basedOn w:val="1"/>
+    <w:qFormat/>
     <w:uiPriority w:val="0"/>
     <w:pPr>
       <w:spacing w:after="120"/>
@@ -13005,6 +13078,7 @@
   <w:style w:type="table" w:styleId="98">
     <w:name w:val="Table Classic 2"/>
     <w:basedOn w:val="12"/>
+    <w:qFormat/>
     <w:uiPriority w:val="0"/>
     <w:pPr>
       <w:widowControl w:val="0"/>
@@ -13166,6 +13240,7 @@
   <w:style w:type="table" w:styleId="100">
     <w:name w:val="Table Classic 4"/>
     <w:basedOn w:val="12"/>
+    <w:qFormat/>
     <w:uiPriority w:val="0"/>
     <w:pPr>
       <w:widowControl w:val="0"/>
@@ -13256,6 +13331,7 @@
   <w:style w:type="table" w:styleId="101">
     <w:name w:val="Table Colorful 1"/>
     <w:basedOn w:val="12"/>
+    <w:qFormat/>
     <w:uiPriority w:val="0"/>
     <w:pPr>
       <w:widowControl w:val="0"/>
@@ -13883,6 +13959,7 @@
   <w:style w:type="table" w:styleId="108">
     <w:name w:val="Table Columns 5"/>
     <w:basedOn w:val="12"/>
+    <w:qFormat/>
     <w:uiPriority w:val="0"/>
     <w:pPr>
       <w:widowControl w:val="0"/>
@@ -14028,6 +14105,7 @@
   <w:style w:type="table" w:styleId="110">
     <w:name w:val="Table Elegant"/>
     <w:basedOn w:val="12"/>
+    <w:qFormat/>
     <w:uiPriority w:val="0"/>
     <w:pPr>
       <w:widowControl w:val="0"/>
@@ -14212,6 +14290,7 @@
   <w:style w:type="table" w:styleId="114">
     <w:name w:val="Table Grid 3"/>
     <w:basedOn w:val="12"/>
+    <w:qFormat/>
     <w:uiPriority w:val="0"/>
     <w:pPr>
       <w:widowControl w:val="0"/>
@@ -14344,6 +14423,7 @@
   <w:style w:type="table" w:styleId="116">
     <w:name w:val="Table Grid 5"/>
     <w:basedOn w:val="12"/>
+    <w:qFormat/>
     <w:uiPriority w:val="0"/>
     <w:pPr>
       <w:widowControl w:val="0"/>
@@ -14411,6 +14491,7 @@
   <w:style w:type="table" w:styleId="117">
     <w:name w:val="Table Grid 6"/>
     <w:basedOn w:val="12"/>
+    <w:qFormat/>
     <w:uiPriority w:val="0"/>
     <w:pPr>
       <w:widowControl w:val="0"/>
@@ -14481,6 +14562,7 @@
   <w:style w:type="table" w:styleId="118">
     <w:name w:val="Table Grid 7"/>
     <w:basedOn w:val="12"/>
+    <w:qFormat/>
     <w:uiPriority w:val="0"/>
     <w:pPr>
       <w:widowControl w:val="0"/>
@@ -14570,6 +14652,7 @@
   <w:style w:type="table" w:styleId="119">
     <w:name w:val="Table Grid 8"/>
     <w:basedOn w:val="12"/>
+    <w:qFormat/>
     <w:uiPriority w:val="0"/>
     <w:pPr>
       <w:widowControl w:val="0"/>
@@ -14635,6 +14718,7 @@
   <w:style w:type="table" w:styleId="120">
     <w:name w:val="Table List 1"/>
     <w:basedOn w:val="12"/>
+    <w:qFormat/>
     <w:uiPriority w:val="0"/>
     <w:pPr>
       <w:widowControl w:val="0"/>
@@ -14856,6 +14940,7 @@
   <w:style w:type="table" w:styleId="123">
     <w:name w:val="Table List 4"/>
     <w:basedOn w:val="12"/>
+    <w:qFormat/>
     <w:uiPriority w:val="0"/>
     <w:pPr>
       <w:widowControl w:val="0"/>
@@ -15107,6 +15192,7 @@
   <w:style w:type="table" w:styleId="127">
     <w:name w:val="Table List 8"/>
     <w:basedOn w:val="12"/>
+    <w:qFormat/>
     <w:uiPriority w:val="0"/>
     <w:pPr>
       <w:widowControl w:val="0"/>
@@ -15272,6 +15358,7 @@
   <w:style w:type="table" w:styleId="131">
     <w:name w:val="Table Simple 1"/>
     <w:basedOn w:val="12"/>
+    <w:qFormat/>
     <w:uiPriority w:val="0"/>
     <w:pPr>
       <w:widowControl w:val="0"/>
@@ -15774,6 +15861,7 @@
     <w:name w:val="toa heading"/>
     <w:basedOn w:val="1"/>
     <w:next w:val="1"/>
+    <w:qFormat/>
     <w:uiPriority w:val="0"/>
     <w:pPr>
       <w:spacing w:before="120"/>
@@ -15795,6 +15883,7 @@
     <w:name w:val="toc 2"/>
     <w:basedOn w:val="1"/>
     <w:next w:val="1"/>
+    <w:qFormat/>
     <w:uiPriority w:val="0"/>
     <w:pPr>
       <w:ind w:left="420" w:leftChars="200"/>
@@ -15834,6 +15923,7 @@
     <w:name w:val="toc 6"/>
     <w:basedOn w:val="1"/>
     <w:next w:val="1"/>
+    <w:qFormat/>
     <w:uiPriority w:val="0"/>
     <w:pPr>
       <w:ind w:left="2100" w:leftChars="1000"/>
@@ -15963,6 +16053,7 @@
   <w:style w:type="table" w:styleId="152">
     <w:name w:val="Light Shading Accent 1"/>
     <w:basedOn w:val="12"/>
+    <w:qFormat/>
     <w:uiPriority w:val="60"/>
     <w:rPr>
       <w:color w:val="365F91"/>
@@ -16588,6 +16679,7 @@
   <w:style w:type="table" w:styleId="159">
     <w:name w:val="Light List Accent 1"/>
     <w:basedOn w:val="12"/>
+    <w:qFormat/>
     <w:uiPriority w:val="61"/>
     <w:tblPr>
       <w:tblBorders>
@@ -16747,6 +16839,7 @@
   <w:style w:type="table" w:styleId="161">
     <w:name w:val="Light List Accent 3"/>
     <w:basedOn w:val="12"/>
+    <w:qFormat/>
     <w:uiPriority w:val="61"/>
     <w:tblPr>
       <w:tblBorders>
@@ -16826,6 +16919,7 @@
   <w:style w:type="table" w:styleId="162">
     <w:name w:val="Light List Accent 4"/>
     <w:basedOn w:val="12"/>
+    <w:qFormat/>
     <w:uiPriority w:val="61"/>
     <w:tblPr>
       <w:tblBorders>
@@ -17065,6 +17159,7 @@
   <w:style w:type="table" w:styleId="165">
     <w:name w:val="Light Grid"/>
     <w:basedOn w:val="12"/>
+    <w:qFormat/>
     <w:uiPriority w:val="62"/>
     <w:tblPr>
       <w:tblBorders>
@@ -17417,6 +17512,7 @@
   <w:style w:type="table" w:styleId="168">
     <w:name w:val="Light Grid Accent 3"/>
     <w:basedOn w:val="12"/>
+    <w:qFormat/>
     <w:uiPriority w:val="62"/>
     <w:tblPr>
       <w:tblBorders>
@@ -17534,6 +17630,7 @@
   <w:style w:type="table" w:styleId="169">
     <w:name w:val="Light Grid Accent 4"/>
     <w:basedOn w:val="12"/>
+    <w:qFormat/>
     <w:uiPriority w:val="62"/>
     <w:tblPr>
       <w:tblBorders>
@@ -17981,6 +18078,7 @@
   <w:style w:type="table" w:styleId="173">
     <w:name w:val="Medium Shading 1 Accent 1"/>
     <w:basedOn w:val="12"/>
+    <w:qFormat/>
     <w:uiPriority w:val="63"/>
     <w:tblPr>
       <w:tblBorders>
@@ -18168,6 +18266,7 @@
   <w:style w:type="table" w:styleId="175">
     <w:name w:val="Medium Shading 1 Accent 3"/>
     <w:basedOn w:val="12"/>
+    <w:qFormat/>
     <w:uiPriority w:val="63"/>
     <w:tblPr>
       <w:tblBorders>
@@ -18355,6 +18454,7 @@
   <w:style w:type="table" w:styleId="177">
     <w:name w:val="Medium Shading 1 Accent 5"/>
     <w:basedOn w:val="12"/>
+    <w:qFormat/>
     <w:uiPriority w:val="63"/>
     <w:tblPr>
       <w:tblBorders>
@@ -19226,6 +19326,7 @@
   <w:style w:type="table" w:styleId="184">
     <w:name w:val="Medium Shading 2 Accent 5"/>
     <w:basedOn w:val="12"/>
+    <w:qFormat/>
     <w:uiPriority w:val="64"/>
     <w:tblPr>
       <w:tblBorders>
@@ -20003,6 +20104,7 @@
   <w:style w:type="table" w:styleId="193">
     <w:name w:val="Medium List 2"/>
     <w:basedOn w:val="12"/>
+    <w:qFormat/>
     <w:uiPriority w:val="66"/>
     <w:rPr>
       <w:rFonts w:ascii="SimSun" w:hAnsi="SimSun" w:eastAsia="Courier New" w:cs="Times New Roman"/>
@@ -20118,6 +20220,7 @@
   <w:style w:type="table" w:styleId="194">
     <w:name w:val="Medium List 2 Accent 1"/>
     <w:basedOn w:val="12"/>
+    <w:qFormat/>
     <w:uiPriority w:val="66"/>
     <w:rPr>
       <w:rFonts w:ascii="SimSun" w:hAnsi="SimSun" w:eastAsia="Courier New" w:cs="Times New Roman"/>
@@ -20349,6 +20452,7 @@
   <w:style w:type="table" w:styleId="196">
     <w:name w:val="Medium List 2 Accent 3"/>
     <w:basedOn w:val="12"/>
+    <w:qFormat/>
     <w:uiPriority w:val="66"/>
     <w:rPr>
       <w:rFonts w:ascii="SimSun" w:hAnsi="SimSun" w:eastAsia="Courier New" w:cs="Times New Roman"/>
@@ -20464,6 +20568,7 @@
   <w:style w:type="table" w:styleId="197">
     <w:name w:val="Medium List 2 Accent 4"/>
     <w:basedOn w:val="12"/>
+    <w:qFormat/>
     <w:uiPriority w:val="66"/>
     <w:rPr>
       <w:rFonts w:ascii="SimSun" w:hAnsi="SimSun" w:eastAsia="Courier New" w:cs="Times New Roman"/>
@@ -20695,6 +20800,7 @@
   <w:style w:type="table" w:styleId="199">
     <w:name w:val="Medium List 2 Accent 6"/>
     <w:basedOn w:val="12"/>
+    <w:qFormat/>
     <w:uiPriority w:val="66"/>
     <w:rPr>
       <w:rFonts w:ascii="SimSun" w:hAnsi="SimSun" w:eastAsia="Courier New" w:cs="Times New Roman"/>
@@ -20810,6 +20916,7 @@
   <w:style w:type="table" w:styleId="200">
     <w:name w:val="Medium Grid 1"/>
     <w:basedOn w:val="12"/>
+    <w:qFormat/>
     <w:uiPriority w:val="67"/>
     <w:tblPr>
       <w:tblBorders>
@@ -20870,6 +20977,7 @@
   <w:style w:type="table" w:styleId="201">
     <w:name w:val="Medium Grid 1 Accent 1"/>
     <w:basedOn w:val="12"/>
+    <w:qFormat/>
     <w:uiPriority w:val="67"/>
     <w:tblPr>
       <w:tblBorders>
@@ -20930,6 +21038,7 @@
   <w:style w:type="table" w:styleId="202">
     <w:name w:val="Medium Grid 1 Accent 2"/>
     <w:basedOn w:val="12"/>
+    <w:qFormat/>
     <w:uiPriority w:val="67"/>
     <w:tblPr>
       <w:tblBorders>
@@ -20990,6 +21099,7 @@
   <w:style w:type="table" w:styleId="203">
     <w:name w:val="Medium Grid 1 Accent 3"/>
     <w:basedOn w:val="12"/>
+    <w:qFormat/>
     <w:uiPriority w:val="67"/>
     <w:tblPr>
       <w:tblBorders>
@@ -21050,6 +21160,7 @@
   <w:style w:type="table" w:styleId="204">
     <w:name w:val="Medium Grid 1 Accent 4"/>
     <w:basedOn w:val="12"/>
+    <w:qFormat/>
     <w:uiPriority w:val="67"/>
     <w:tblPr>
       <w:tblBorders>
@@ -21171,6 +21282,7 @@
   <w:style w:type="table" w:styleId="206">
     <w:name w:val="Medium Grid 1 Accent 6"/>
     <w:basedOn w:val="12"/>
+    <w:qFormat/>
     <w:uiPriority w:val="67"/>
     <w:tblPr>
       <w:tblBorders>
@@ -21231,6 +21343,7 @@
   <w:style w:type="table" w:styleId="207">
     <w:name w:val="Medium Grid 2"/>
     <w:basedOn w:val="12"/>
+    <w:qFormat/>
     <w:uiPriority w:val="68"/>
     <w:rPr>
       <w:rFonts w:ascii="SimSun" w:hAnsi="SimSun" w:eastAsia="Courier New" w:cs="Times New Roman"/>
@@ -21343,6 +21456,7 @@
   <w:style w:type="table" w:styleId="208">
     <w:name w:val="Medium Grid 2 Accent 1"/>
     <w:basedOn w:val="12"/>
+    <w:qFormat/>
     <w:uiPriority w:val="68"/>
     <w:rPr>
       <w:rFonts w:ascii="SimSun" w:hAnsi="SimSun" w:eastAsia="Courier New" w:cs="Times New Roman"/>
@@ -21455,6 +21569,7 @@
   <w:style w:type="table" w:styleId="209">
     <w:name w:val="Medium Grid 2 Accent 2"/>
     <w:basedOn w:val="12"/>
+    <w:qFormat/>
     <w:uiPriority w:val="68"/>
     <w:rPr>
       <w:rFonts w:ascii="SimSun" w:hAnsi="SimSun" w:eastAsia="Courier New" w:cs="Times New Roman"/>
@@ -21567,6 +21682,7 @@
   <w:style w:type="table" w:styleId="210">
     <w:name w:val="Medium Grid 2 Accent 3"/>
     <w:basedOn w:val="12"/>
+    <w:qFormat/>
     <w:uiPriority w:val="68"/>
     <w:rPr>
       <w:rFonts w:ascii="SimSun" w:hAnsi="SimSun" w:eastAsia="Courier New" w:cs="Times New Roman"/>
@@ -21679,6 +21795,7 @@
   <w:style w:type="table" w:styleId="211">
     <w:name w:val="Medium Grid 2 Accent 4"/>
     <w:basedOn w:val="12"/>
+    <w:qFormat/>
     <w:uiPriority w:val="68"/>
     <w:rPr>
       <w:rFonts w:ascii="SimSun" w:hAnsi="SimSun" w:eastAsia="Courier New" w:cs="Times New Roman"/>
@@ -22017,6 +22134,7 @@
   <w:style w:type="table" w:styleId="214">
     <w:name w:val="Medium Grid 3"/>
     <w:basedOn w:val="12"/>
+    <w:qFormat/>
     <w:uiPriority w:val="69"/>
     <w:tblPr>
       <w:tblBorders>
@@ -22145,6 +22263,7 @@
   <w:style w:type="table" w:styleId="215">
     <w:name w:val="Medium Grid 3 Accent 1"/>
     <w:basedOn w:val="12"/>
+    <w:qFormat/>
     <w:uiPriority w:val="69"/>
     <w:tblPr>
       <w:tblBorders>
@@ -23329,6 +23448,7 @@
   <w:style w:type="table" w:styleId="225">
     <w:name w:val="Dark List Accent 4"/>
     <w:basedOn w:val="12"/>
+    <w:qFormat/>
     <w:uiPriority w:val="70"/>
     <w:rPr>
       <w:color w:val="FFFFFF"/>
@@ -23857,6 +23977,7 @@
   <w:style w:type="table" w:styleId="230">
     <w:name w:val="Colorful Shading Accent 2"/>
     <w:basedOn w:val="12"/>
+    <w:qFormat/>
     <w:uiPriority w:val="71"/>
     <w:rPr>
       <w:color w:val="000000"/>
@@ -24392,6 +24513,7 @@
   <w:style w:type="table" w:styleId="235">
     <w:name w:val="Colorful List"/>
     <w:basedOn w:val="12"/>
+    <w:qFormat/>
     <w:uiPriority w:val="72"/>
     <w:rPr>
       <w:color w:val="000000"/>
@@ -24542,6 +24664,7 @@
   <w:style w:type="table" w:styleId="237">
     <w:name w:val="Colorful List Accent 2"/>
     <w:basedOn w:val="12"/>
+    <w:qFormat/>
     <w:uiPriority w:val="72"/>
     <w:rPr>
       <w:color w:val="000000"/>
@@ -24692,6 +24815,7 @@
   <w:style w:type="table" w:styleId="239">
     <w:name w:val="Colorful List Accent 4"/>
     <w:basedOn w:val="12"/>
+    <w:qFormat/>
     <w:uiPriority w:val="72"/>
     <w:rPr>
       <w:color w:val="000000"/>

</xml_diff>